<commit_message>
Refactor KPI recovery mockup and update related screens
- Adjusted styles and dimensions in 06-kpi-recovery.html for better layout and readability.
- Updated KPI labels and statuses to reflect current metrics and health indicators.
- Revised tier labels and achievement metrics for clarity in 06-kpi-recovery.html.
- Modified weekly session mockup in 07-weekly-session.html to reflect updated scoring and escalation logic.
- Enhanced quarterly review mockup in 08-quarterly-review.html for improved clarity on rules and methods.
- Updated channels mockup in 09-channels.html to clarify escalation steps and check-in statuses.
- Refined review inbox mockup in 10-review-inbox.html to improve clarity on escalation ladder and semantic reviews.
- Added README.md to provide context and guidelines for mockup usage and authority.
</commit_message>
<xml_diff>
--- a/docs/stakeholder/OpenOKR-Overview.docx
+++ b/docs/stakeholder/OpenOKR-Overview.docx
@@ -2502,10 +2502,7 @@
         <w:t xml:space="preserve">recovery objective</w:t>
       </w:r>
       <w:r>
-        <w:t xml:space="preserve"> </w:t>
-      </w:r>
-      <w:r>
-        <w:t xml:space="preserve">from its own leading drivers. The KPI then reads</w:t>
+        <w:t xml:space="preserve">, one key result per leading child driver. The KPI then reads</w:t>
       </w:r>
       <w:r>
         <w:t xml:space="preserve"> </w:t>
@@ -2526,7 +2523,7 @@
           <wp:inline>
             <wp:extent cx="5943600" cy="3302000"/>
             <wp:effectExtent b="0" l="0" r="0" t="0"/>
-            <wp:docPr descr="A KPI driver tree with a live recovery objective. Net revenue retention is at seventy-one percent of target, below the corridor floor, but the recovery is half complete so effective health reads seventy-nine. The recovery board lists every unhealthy KPI across every tree with a one-click launch." title="" id="39" name="Picture"/>
+            <wp:docPr descr="A KPI driver tree with a live recovery objective. Expansion revenue sits at forty-three percent of target. It was forty percent when the recovery launched and the recovery is forty-nine percent complete, so effective health reads sixty-five: the fix shows before the lagging number catches up. Each key result comes from one leading child driver. The recovery board lists every unhealthy KPI across every tree with a one-click launch." title="" id="39" name="Picture"/>
             <a:graphic>
               <a:graphicData uri="http://schemas.openxmlformats.org/drawingml/2006/picture">
                 <pic:pic>
@@ -2569,7 +2566,7 @@
         <w:pStyle w:val="ImageCaption"/>
       </w:pPr>
       <w:r>
-        <w:t xml:space="preserve">A KPI driver tree with a live recovery objective. Net revenue retention is at seventy-one percent of target, below the corridor floor, but the recovery is half complete so effective health reads seventy-nine. The recovery board lists every unhealthy KPI across every tree with a one-click launch.</w:t>
+        <w:t xml:space="preserve">A KPI driver tree with a live recovery objective. Expansion revenue sits at forty-three percent of target. It was forty percent when the recovery launched and the recovery is forty-nine percent complete, so effective health reads sixty-five: the fix shows before the lagging number catches up. Each key result comes from one leading child driver. The recovery board lists every unhealthy KPI across every tree with a one-click launch.</w:t>
       </w:r>
     </w:p>
     <w:bookmarkEnd w:id="41"/>

</xml_diff>